<commit_message>
Carte de septembre 2026 remise au format du modèle
Nouveaux vins (Mourgues du Grès, J.-B. Senat, Fabien Jouves), nouveaux prix,
spiritueux et tapas mis à jour, nouveau label « Vin nature ». 145 prix
vérifiés contre la carte du bar. Carte d'origine rangée dans archives/.

Co-Authored-By: Claude Opus 5.5 <noreply@anthropic.com>
Claude-Session: https://claude.ai/code/session_01AB78gB8M1bSUG27ARgCpgB
</commit_message>
<xml_diff>
--- a/MENU/Carte Clandestin - modele.docx
+++ b/MENU/Carte Clandestin - modele.docx
@@ -68,9 +68,9 @@
       <w:r>
         <w:t>Le Cellier des Chartreux – Chamasûtra</w:t>
         <w:tab/>
-        <w:t>4,50 €</w:t>
+        <w:t>5,00 €</w:t>
         <w:tab/>
-        <w:t>24,00 €</w:t>
+        <w:t>25,00 €</w:t>
       </w:r>
     </w:p>
     <w:p>
@@ -116,7 +116,7 @@
       <w:r>
         <w:t>Le Clos d’Elle – Sur la comète</w:t>
         <w:tab/>
-        <w:t>5,00 €</w:t>
+        <w:t>5,50 €</w:t>
         <w:tab/>
         <w:t>27,00 €</w:t>
       </w:r>
@@ -156,7 +156,7 @@
       <w:r>
         <w:t>Domaine de Roquemale – Meli Melo</w:t>
         <w:tab/>
-        <w:t>5,50 €</w:t>
+        <w:t>6,00 €</w:t>
         <w:tab/>
         <w:t>28,00 €</w:t>
       </w:r>
@@ -204,7 +204,7 @@
       <w:r>
         <w:t>Domaine Guinand – Cuvée Vieilles Vignes</w:t>
         <w:tab/>
-        <w:t>5,50 €</w:t>
+        <w:t>6,00 €</w:t>
         <w:tab/>
         <w:t>28,00 €</w:t>
       </w:r>
@@ -252,9 +252,9 @@
       <w:r>
         <w:t>Château Lancyre – Le Clos des Combes</w:t>
         <w:tab/>
-        <w:t>5,50 €</w:t>
+        <w:t>6,00 €</w:t>
         <w:tab/>
-        <w:t>30,00 €</w:t>
+        <w:t>29,00 €</w:t>
       </w:r>
     </w:p>
     <w:p>
@@ -300,9 +300,9 @@
       <w:r>
         <w:t>Clos du Serres – Cuvée Saint Jean</w:t>
         <w:tab/>
-        <w:t>6,00 €</w:t>
+        <w:t>6,50 €</w:t>
         <w:tab/>
-        <w:t>32,00 €</w:t>
+        <w:t>29,00 €</w:t>
       </w:r>
     </w:p>
     <w:p>
@@ -346,11 +346,11 @@
         </w:tabs>
       </w:pPr>
       <w:r>
-        <w:t>Domaine Girard – Pinot Noir</w:t>
+        <w:t>Château Mourgues du Grès – Les Galets Rouges</w:t>
         <w:tab/>
         <w:t>6,50 €</w:t>
         <w:tab/>
-        <w:t>32,00 €</w:t>
+        <w:t>29,00 €</w:t>
       </w:r>
     </w:p>
     <w:p>
@@ -366,7 +366,7 @@
         <w:pStyle w:val="Appellation"/>
       </w:pPr>
       <w:r>
-        <w:t>IGP Pays d’Oc</w:t>
+        <w:t>AOP Costières de Nîmes</w:t>
       </w:r>
     </w:p>
     <w:p>
@@ -374,7 +374,7 @@
         <w:pStyle w:val="Cépages"/>
       </w:pPr>
       <w:r>
-        <w:t>100% Pinot Noir</w:t>
+        <w:t>Syrah, Grenache, Mourvèdre, Carignan</w:t>
       </w:r>
     </w:p>
     <w:p>
@@ -382,7 +382,7 @@
         <w:pStyle w:val="Description"/>
       </w:pPr>
       <w:r>
-        <w:t>Fructuosité intense avec une légère note balsamique et résineuse. Texture tannique fine avec finale juteuse et fruitée.</w:t>
+        <w:t>Nez sur les fruits noirs enrichis d’épices et de cacao. Bouche généreuse et gourmande. Tanins fondus.</w:t>
       </w:r>
     </w:p>
     <w:p>
@@ -442,11 +442,11 @@
         </w:tabs>
       </w:pPr>
       <w:r>
-        <w:t>Domaine Ollier Taillefer – Grande Réserve</w:t>
+        <w:t>Domaine Jean-Baptiste Senat – Arbalètes et Coquelicots</w:t>
         <w:tab/>
         <w:t>6,50 €</w:t>
         <w:tab/>
-        <w:t>36,00 €</w:t>
+        <w:t>30,00 €</w:t>
       </w:r>
     </w:p>
     <w:p>
@@ -454,7 +454,7 @@
         <w:pStyle w:val="Labels"/>
       </w:pPr>
       <w:r>
-        <w:t>Bio</w:t>
+        <w:t>Vin nature</w:t>
       </w:r>
     </w:p>
     <w:p>
@@ -462,7 +462,7 @@
         <w:pStyle w:val="Appellation"/>
       </w:pPr>
       <w:r>
-        <w:t>AOP Faugères</w:t>
+        <w:t>IGP Pays d’Oc</w:t>
       </w:r>
     </w:p>
     <w:p>
@@ -470,7 +470,7 @@
         <w:pStyle w:val="Cépages"/>
       </w:pPr>
       <w:r>
-        <w:t>Syrah, Grenache, Carignan</w:t>
+        <w:t>70% Carignan, 15% Grenache, 15% Mourvèdre</w:t>
       </w:r>
     </w:p>
     <w:p>
@@ -478,7 +478,7 @@
         <w:pStyle w:val="Description"/>
       </w:pPr>
       <w:r>
-        <w:t>Notes de petits fruits rouges, d’épices douces de réglisse, attaque gourmande, charnue et ronde, tanins soyeux.</w:t>
+        <w:t>Robe claire et vive aux contours violacés. Bouche sur le fruit, la fraîcheur, la senteur et la vivacité.</w:t>
       </w:r>
     </w:p>
     <w:p>
@@ -490,9 +490,49 @@
         </w:tabs>
       </w:pPr>
       <w:r>
+        <w:t>Domaine Girard – Pinot Noir</w:t>
+        <w:tab/>
+        <w:t>7,00 €</w:t>
+        <w:tab/>
+        <w:t>32,00 €</w:t>
+      </w:r>
+    </w:p>
+    <w:p>
+      <w:pPr>
+        <w:pStyle w:val="Appellation"/>
+      </w:pPr>
+      <w:r>
+        <w:t>IGP Pays d’Oc</w:t>
+      </w:r>
+    </w:p>
+    <w:p>
+      <w:pPr>
+        <w:pStyle w:val="Cépages"/>
+      </w:pPr>
+      <w:r>
+        <w:t>100% Pinot Noir</w:t>
+      </w:r>
+    </w:p>
+    <w:p>
+      <w:pPr>
+        <w:pStyle w:val="Description"/>
+      </w:pPr>
+      <w:r>
+        <w:t>Fructuosité intense avec une légère note balsamique et résineuse. Texture tannique fine avec finale juteuse et fruitée.</w:t>
+      </w:r>
+    </w:p>
+    <w:p>
+      <w:pPr>
+        <w:pStyle w:val="Article"/>
+        <w:tabs>
+          <w:tab w:pos="8107" w:val="right"/>
+          <w:tab w:pos="9638" w:val="right"/>
+        </w:tabs>
+      </w:pPr>
+      <w:r>
         <w:t>Domaine de l’Hortus – Bergerie de l’Hortus</w:t>
         <w:tab/>
-        <w:t>6,50 €</w:t>
+        <w:t>7,50 €</w:t>
         <w:tab/>
         <w:t>36,00 €</w:t>
       </w:r>
@@ -555,9 +595,9 @@
       <w:r>
         <w:t>Le Cellier des Chartreux – Je donne ma langue au chat</w:t>
         <w:tab/>
-        <w:t>4,50 €</w:t>
+        <w:t>5,00 €</w:t>
         <w:tab/>
-        <w:t>24,00 €</w:t>
+        <w:t>25,00 €</w:t>
       </w:r>
     </w:p>
     <w:p>
@@ -603,7 +643,7 @@
       <w:r>
         <w:t>Domaine Canet – Chardonnay</w:t>
         <w:tab/>
-        <w:t>5,00 €</w:t>
+        <w:t>5,50 €</w:t>
         <w:tab/>
         <w:t>26,00 €</w:t>
       </w:r>
@@ -651,7 +691,7 @@
       <w:r>
         <w:t>Mas d’Arcaÿ – Cuvée Jean l’Effronté</w:t>
         <w:tab/>
-        <w:t>5,50 €</w:t>
+        <w:t>6,00 €</w:t>
         <w:tab/>
         <w:t>27,00 €</w:t>
       </w:r>
@@ -699,7 +739,7 @@
       <w:r>
         <w:t>Domaine Puech Auger – Cuvée l’Envie</w:t>
         <w:tab/>
-        <w:t>5,50 €</w:t>
+        <w:t>6,00 €</w:t>
         <w:tab/>
         <w:t>27,00 €</w:t>
       </w:r>
@@ -747,9 +787,9 @@
       <w:r>
         <w:t>Le Clos d’Elle – Cuvée Rouviège</w:t>
         <w:tab/>
-        <w:t>6,00 €</w:t>
+        <w:t>6,50 €</w:t>
         <w:tab/>
-        <w:t>27,00 €</w:t>
+        <w:t>30,00 €</w:t>
       </w:r>
     </w:p>
     <w:p>
@@ -797,7 +837,7 @@
         <w:tab/>
         <w:t>6,50 €</w:t>
         <w:tab/>
-        <w:t>32,00 €</w:t>
+        <w:t>30,00 €</w:t>
       </w:r>
     </w:p>
     <w:p>
@@ -841,9 +881,57 @@
         </w:tabs>
       </w:pPr>
       <w:r>
+        <w:t>Domaine Fabien Jouves – Les Agudes</w:t>
+        <w:tab/>
+        <w:t>6,50 €</w:t>
+        <w:tab/>
+        <w:t>30,00 €</w:t>
+      </w:r>
+    </w:p>
+    <w:p>
+      <w:pPr>
+        <w:pStyle w:val="Labels"/>
+      </w:pPr>
+      <w:r>
+        <w:t>Vin nature</w:t>
+      </w:r>
+    </w:p>
+    <w:p>
+      <w:pPr>
+        <w:pStyle w:val="Appellation"/>
+      </w:pPr>
+      <w:r>
+        <w:t>Vin de France</w:t>
+      </w:r>
+    </w:p>
+    <w:p>
+      <w:pPr>
+        <w:pStyle w:val="Cépages"/>
+      </w:pPr>
+      <w:r>
+        <w:t>Colombard, Sauvignon Blanc</w:t>
+      </w:r>
+    </w:p>
+    <w:p>
+      <w:pPr>
+        <w:pStyle w:val="Description"/>
+      </w:pPr>
+      <w:r>
+        <w:t>Au nez comme en bouche, on retrouve des effluves d’agrumes, de cédrat et de discrètes notes de fruits à chair blanche.</w:t>
+      </w:r>
+    </w:p>
+    <w:p>
+      <w:pPr>
+        <w:pStyle w:val="Article"/>
+        <w:tabs>
+          <w:tab w:pos="8107" w:val="right"/>
+          <w:tab w:pos="9638" w:val="right"/>
+        </w:tabs>
+      </w:pPr>
+      <w:r>
         <w:t>Domaine Girard – Las Salvios</w:t>
         <w:tab/>
-        <w:t>6,50 €</w:t>
+        <w:t>7,00 €</w:t>
         <w:tab/>
         <w:t>32,00 €</w:t>
       </w:r>
@@ -914,9 +1002,9 @@
       <w:r>
         <w:t>Domaine Joÿ – Saint André</w:t>
         <w:tab/>
-        <w:t>5,50 €</w:t>
+        <w:t>6,00 €</w:t>
         <w:tab/>
-        <w:t>27,00 €</w:t>
+        <w:t>28,00 €</w:t>
       </w:r>
     </w:p>
     <w:p>
@@ -964,7 +1052,7 @@
         <w:tab/>
         <w:t>6,00 €</w:t>
         <w:tab/>
-        <w:t>30,00 €</w:t>
+        <w:t>28,00 €</w:t>
       </w:r>
     </w:p>
     <w:p>
@@ -1033,9 +1121,9 @@
       <w:r>
         <w:t>Le Cellier des Chartreux – La nuit tous les chats sont gris</w:t>
         <w:tab/>
-        <w:t>4,50 €</w:t>
+        <w:t>5,00 €</w:t>
         <w:tab/>
-        <w:t>23,00 €</w:t>
+        <w:t>25,00 €</w:t>
       </w:r>
     </w:p>
     <w:p>
@@ -1170,7 +1258,7 @@
         <w:tab/>
         <w:t>6,50 €</w:t>
         <w:tab/>
-        <w:t>34,00 €</w:t>
+        <w:t>33,00 €</w:t>
       </w:r>
     </w:p>
     <w:p>
@@ -1438,17 +1526,9 @@
         </w:tabs>
       </w:pPr>
       <w:r>
-        <w:t>Ti’Punch</w:t>
+        <w:t>Jägerbomb</w:t>
         <w:tab/>
-        <w:t>9,00 €</w:t>
-      </w:r>
-    </w:p>
-    <w:p>
-      <w:pPr>
-        <w:pStyle w:val="Description"/>
-      </w:pPr>
-      <w:r>
-        <w:t>Rhum agricole, citron vert, cassonade, sirop de canne</w:t>
+        <w:t>6,00 €</w:t>
       </w:r>
     </w:p>
     <w:p>
@@ -1459,7 +1539,7 @@
         </w:tabs>
       </w:pPr>
       <w:r>
-        <w:t>Green Stormy</w:t>
+        <w:t>Ti’Punch</w:t>
         <w:tab/>
         <w:t>9,00 €</w:t>
       </w:r>
@@ -1469,7 +1549,7 @@
         <w:pStyle w:val="Description"/>
       </w:pPr>
       <w:r>
-        <w:t>Rhum ambré, ginger ale, jus de citron vert, sirop basilic</w:t>
+        <w:t>Rhum agricole, citron vert, cassonade, sirop de canne</w:t>
       </w:r>
     </w:p>
     <w:p>
@@ -1480,7 +1560,7 @@
         </w:tabs>
       </w:pPr>
       <w:r>
-        <w:t>Moscow Mule</w:t>
+        <w:t>Green Stormy</w:t>
         <w:tab/>
         <w:t>9,00 €</w:t>
       </w:r>
@@ -1490,7 +1570,7 @@
         <w:pStyle w:val="Description"/>
       </w:pPr>
       <w:r>
-        <w:t>Vodka, ginger ale, citron vert, menthe fraîche</w:t>
+        <w:t>Rhum ambré, ginger ale, jus de citron vert, sirop basilic</w:t>
       </w:r>
     </w:p>
     <w:p>
@@ -1501,7 +1581,7 @@
         </w:tabs>
       </w:pPr>
       <w:r>
-        <w:t>Espresso Martini</w:t>
+        <w:t>Moscow Mule</w:t>
         <w:tab/>
         <w:t>9,00 €</w:t>
       </w:r>
@@ -1511,7 +1591,7 @@
         <w:pStyle w:val="Description"/>
       </w:pPr>
       <w:r>
-        <w:t>Vodka, liqueur de café, espresso</w:t>
+        <w:t>Vodka, ginger ale, citron vert, menthe fraîche</w:t>
       </w:r>
     </w:p>
     <w:p>
@@ -1522,7 +1602,7 @@
         </w:tabs>
       </w:pPr>
       <w:r>
-        <w:t>Gin &amp; Tonic</w:t>
+        <w:t>Espresso Martini</w:t>
         <w:tab/>
         <w:t>9,00 €</w:t>
       </w:r>
@@ -1532,7 +1612,7 @@
         <w:pStyle w:val="Description"/>
       </w:pPr>
       <w:r>
-        <w:t>Gin, tonic</w:t>
+        <w:t>Vodka, liqueur de café, espresso</w:t>
       </w:r>
     </w:p>
     <w:p>
@@ -1648,6 +1728,40 @@
         </w:tabs>
       </w:pPr>
       <w:r>
+        <w:t>Gin &amp; Tonic</w:t>
+        <w:tab/>
+        <w:t>10,00 €</w:t>
+      </w:r>
+    </w:p>
+    <w:p>
+      <w:pPr>
+        <w:pStyle w:val="Article"/>
+        <w:tabs>
+          <w:tab w:pos="9638" w:val="right"/>
+        </w:tabs>
+      </w:pPr>
+      <w:r>
+        <w:t>Gin &amp; Tonic Premium</w:t>
+        <w:tab/>
+        <w:t>12,00 €</w:t>
+      </w:r>
+    </w:p>
+    <w:p>
+      <w:pPr>
+        <w:pStyle w:val="Description"/>
+      </w:pPr>
+      <w:r>
+        <w:t>Gin au choix, tonic Fever-Tree</w:t>
+      </w:r>
+    </w:p>
+    <w:p>
+      <w:pPr>
+        <w:pStyle w:val="Article"/>
+        <w:tabs>
+          <w:tab w:pos="9638" w:val="right"/>
+        </w:tabs>
+      </w:pPr>
+      <w:r>
         <w:t>Old Fashioned</w:t>
         <w:tab/>
         <w:t>12,00 €</w:t>
@@ -1689,7 +1803,7 @@
         </w:tabs>
       </w:pPr>
       <w:r>
-        <w:t>Aperol Spritz ou Campari Spritz</w:t>
+        <w:t>Spritz liqueur au choix</w:t>
         <w:tab/>
         <w:t>9,00 €</w:t>
       </w:r>
@@ -1699,7 +1813,7 @@
         <w:pStyle w:val="Description"/>
       </w:pPr>
       <w:r>
-        <w:t>Prosecco, Perrier, Aperol ou Campari</w:t>
+        <w:t>Aperol, Campari, mangue, vanille, cassis, citron, orange, limoncello…</w:t>
       </w:r>
     </w:p>
     <w:p>
@@ -1710,17 +1824,29 @@
         </w:tabs>
       </w:pPr>
       <w:r>
-        <w:t>Spritz mangue, vanille, cassis, citron ou orange</w:t>
+        <w:t>St Germain Spritz</w:t>
         <w:tab/>
-        <w:t>10,00 €</w:t>
-      </w:r>
-    </w:p>
-    <w:p>
-      <w:pPr>
-        <w:pStyle w:val="Description"/>
-      </w:pPr>
-      <w:r>
-        <w:t>Prosecco, Perrier, liqueur</w:t>
+        <w:t>12,00 €</w:t>
+      </w:r>
+    </w:p>
+    <w:p>
+      <w:pPr>
+        <w:pStyle w:val="Heading1"/>
+      </w:pPr>
+      <w:r>
+        <w:t>Liqueurs et apéritifs</w:t>
+      </w:r>
+    </w:p>
+    <w:p>
+      <w:pPr>
+        <w:pStyle w:val="Formats"/>
+        <w:tabs>
+          <w:tab w:pos="9638" w:val="right"/>
+        </w:tabs>
+      </w:pPr>
+      <w:r>
+        <w:tab/>
+        <w:t>Prix</w:t>
       </w:r>
     </w:p>
     <w:p>
@@ -1731,17 +1857,9 @@
         </w:tabs>
       </w:pPr>
       <w:r>
-        <w:t>Hugo Spritz</w:t>
+        <w:t>Ricard</w:t>
         <w:tab/>
-        <w:t>10,00 €</w:t>
-      </w:r>
-    </w:p>
-    <w:p>
-      <w:pPr>
-        <w:pStyle w:val="Description"/>
-      </w:pPr>
-      <w:r>
-        <w:t>Prosecco, Perrier, liqueur de sureau</w:t>
+        <w:t>3,50 €</w:t>
       </w:r>
     </w:p>
     <w:p>
@@ -1752,17 +1870,48 @@
         </w:tabs>
       </w:pPr>
       <w:r>
-        <w:t>St Germain Spritz</w:t>
+        <w:t>Limoncello</w:t>
         <w:tab/>
-        <w:t>12,00 €</w:t>
-      </w:r>
-    </w:p>
-    <w:p>
-      <w:pPr>
-        <w:pStyle w:val="Description"/>
-      </w:pPr>
-      <w:r>
-        <w:t>Prosecco, Perrier, St Germain</w:t>
+        <w:t>5,00 €</w:t>
+      </w:r>
+    </w:p>
+    <w:p>
+      <w:pPr>
+        <w:pStyle w:val="Article"/>
+        <w:tabs>
+          <w:tab w:pos="9638" w:val="right"/>
+        </w:tabs>
+      </w:pPr>
+      <w:r>
+        <w:t>Get 27</w:t>
+        <w:tab/>
+        <w:t>5,50 €</w:t>
+      </w:r>
+    </w:p>
+    <w:p>
+      <w:pPr>
+        <w:pStyle w:val="Article"/>
+        <w:tabs>
+          <w:tab w:pos="9638" w:val="right"/>
+        </w:tabs>
+      </w:pPr>
+      <w:r>
+        <w:t>Baileys Irish Cream</w:t>
+        <w:tab/>
+        <w:t>5,50 €</w:t>
+      </w:r>
+    </w:p>
+    <w:p>
+      <w:pPr>
+        <w:pStyle w:val="Article"/>
+        <w:tabs>
+          <w:tab w:pos="9638" w:val="right"/>
+        </w:tabs>
+      </w:pPr>
+      <w:r>
+        <w:t>Martini</w:t>
+        <w:tab/>
+        <w:t>5,50 €</w:t>
       </w:r>
     </w:p>
     <w:p>
@@ -1770,7 +1919,15 @@
         <w:pStyle w:val="Heading1"/>
       </w:pPr>
       <w:r>
-        <w:t>Liqueurs et apéritifs</w:t>
+        <w:t>Spiritueux</w:t>
+      </w:r>
+    </w:p>
+    <w:p>
+      <w:pPr>
+        <w:pStyle w:val="Heading2"/>
+      </w:pPr>
+      <w:r>
+        <w:t>Whisky</w:t>
       </w:r>
     </w:p>
     <w:p>
@@ -1793,9 +1950,9 @@
         </w:tabs>
       </w:pPr>
       <w:r>
-        <w:t>Ricard</w:t>
+        <w:t>Bulleit Bourbon – 45°</w:t>
         <w:tab/>
-        <w:t>3,50 €</w:t>
+        <w:t>10,00 €</w:t>
       </w:r>
     </w:p>
     <w:p>
@@ -1806,9 +1963,9 @@
         </w:tabs>
       </w:pPr>
       <w:r>
-        <w:t>Get 27</w:t>
+        <w:t>Monkey Shoulder – 40°</w:t>
         <w:tab/>
-        <w:t>5,50 €</w:t>
+        <w:t>10,00 €</w:t>
       </w:r>
     </w:p>
     <w:p>
@@ -1819,17 +1976,22 @@
         </w:tabs>
       </w:pPr>
       <w:r>
-        <w:t>Baileys Irish Cream</w:t>
+        <w:t>Tullamore Dew – 40°</w:t>
         <w:tab/>
-        <w:t>5,50 €</w:t>
-      </w:r>
-    </w:p>
-    <w:p>
-      <w:pPr>
-        <w:pStyle w:val="Heading1"/>
-      </w:pPr>
-      <w:r>
-        <w:t>Spiritueux</w:t>
+        <w:t>10,00 €</w:t>
+      </w:r>
+    </w:p>
+    <w:p>
+      <w:pPr>
+        <w:pStyle w:val="Article"/>
+        <w:tabs>
+          <w:tab w:pos="9638" w:val="right"/>
+        </w:tabs>
+      </w:pPr>
+      <w:r>
+        <w:t>Talisker Port Ruighe – 45,8°</w:t>
+        <w:tab/>
+        <w:t>12,00 €</w:t>
       </w:r>
     </w:p>
     <w:p>
@@ -1837,7 +1999,7 @@
         <w:pStyle w:val="Heading2"/>
       </w:pPr>
       <w:r>
-        <w:t>Whisky</w:t>
+        <w:t>Gin</w:t>
       </w:r>
     </w:p>
     <w:p>
@@ -1860,7 +2022,7 @@
         </w:tabs>
       </w:pPr>
       <w:r>
-        <w:t>Bulleit Bourbon – 45°</w:t>
+        <w:t>Hendrick’s – 41,4°</w:t>
         <w:tab/>
         <w:t>10,00 €</w:t>
       </w:r>
@@ -1873,9 +2035,37 @@
         </w:tabs>
       </w:pPr>
       <w:r>
-        <w:t>Glenmorangie 10 ans Original – 40°</w:t>
+        <w:t>Etsu – 43°</w:t>
         <w:tab/>
-        <w:t>12,00 €</w:t>
+        <w:t>10,00 €</w:t>
+      </w:r>
+    </w:p>
+    <w:p>
+      <w:pPr>
+        <w:pStyle w:val="Description"/>
+      </w:pPr>
+      <w:r>
+        <w:t>Original, Double Yuzu ou Sakura</w:t>
+      </w:r>
+    </w:p>
+    <w:p>
+      <w:pPr>
+        <w:pStyle w:val="Heading2"/>
+      </w:pPr>
+      <w:r>
+        <w:t>Rhum</w:t>
+      </w:r>
+    </w:p>
+    <w:p>
+      <w:pPr>
+        <w:pStyle w:val="Formats"/>
+        <w:tabs>
+          <w:tab w:pos="9638" w:val="right"/>
+        </w:tabs>
+      </w:pPr>
+      <w:r>
+        <w:tab/>
+        <w:t>Prix</w:t>
       </w:r>
     </w:p>
     <w:p>
@@ -1886,86 +2076,7 @@
         </w:tabs>
       </w:pPr>
       <w:r>
-        <w:t>Talisker Port Ruighe – 45,8°</w:t>
-        <w:tab/>
-        <w:t>12,00 €</w:t>
-      </w:r>
-    </w:p>
-    <w:p>
-      <w:pPr>
-        <w:pStyle w:val="Heading2"/>
-      </w:pPr>
-      <w:r>
-        <w:t>Gin</w:t>
-      </w:r>
-    </w:p>
-    <w:p>
-      <w:pPr>
-        <w:pStyle w:val="Formats"/>
-        <w:tabs>
-          <w:tab w:pos="9638" w:val="right"/>
-        </w:tabs>
-      </w:pPr>
-      <w:r>
-        <w:tab/>
-        <w:t>Prix</w:t>
-      </w:r>
-    </w:p>
-    <w:p>
-      <w:pPr>
-        <w:pStyle w:val="Article"/>
-        <w:tabs>
-          <w:tab w:pos="9638" w:val="right"/>
-        </w:tabs>
-      </w:pPr>
-      <w:r>
-        <w:t>The Botanist – 46°</w:t>
-        <w:tab/>
-        <w:t>10,00 €</w:t>
-      </w:r>
-    </w:p>
-    <w:p>
-      <w:pPr>
-        <w:pStyle w:val="Article"/>
-        <w:tabs>
-          <w:tab w:pos="9638" w:val="right"/>
-        </w:tabs>
-      </w:pPr>
-      <w:r>
-        <w:t>Etsu – 43°</w:t>
-        <w:tab/>
-        <w:t>10,00 €</w:t>
-      </w:r>
-    </w:p>
-    <w:p>
-      <w:pPr>
-        <w:pStyle w:val="Heading2"/>
-      </w:pPr>
-      <w:r>
-        <w:t>Rhum</w:t>
-      </w:r>
-    </w:p>
-    <w:p>
-      <w:pPr>
-        <w:pStyle w:val="Formats"/>
-        <w:tabs>
-          <w:tab w:pos="9638" w:val="right"/>
-        </w:tabs>
-      </w:pPr>
-      <w:r>
-        <w:tab/>
-        <w:t>Prix</w:t>
-      </w:r>
-    </w:p>
-    <w:p>
-      <w:pPr>
-        <w:pStyle w:val="Article"/>
-        <w:tabs>
-          <w:tab w:pos="9638" w:val="right"/>
-        </w:tabs>
-      </w:pPr>
-      <w:r>
-        <w:t>Diplomatico Reserva Exclusiva – 40°</w:t>
+        <w:t>Secha de la Silva – 40°</w:t>
         <w:tab/>
         <w:t>10,00 €</w:t>
       </w:r>
@@ -2121,9 +2232,9 @@
       <w:r>
         <w:t>Étape IPA, Sacrilège – 6,5°</w:t>
         <w:tab/>
-        <w:t>4,50 €</w:t>
+        <w:t>5,00 €</w:t>
         <w:tab/>
-        <w:t>7,50 €</w:t>
+        <w:t>8,00 €</w:t>
       </w:r>
     </w:p>
     <w:p>
@@ -2153,9 +2264,9 @@
       <w:r>
         <w:t>Loomi, Sacrilège – 4,6°</w:t>
         <w:tab/>
-        <w:t>4,50 €</w:t>
+        <w:t>5,00 €</w:t>
         <w:tab/>
-        <w:t>7,50 €</w:t>
+        <w:t>8,00 €</w:t>
       </w:r>
     </w:p>
     <w:p>
@@ -2316,7 +2427,7 @@
       <w:r>
         <w:t>Virgin Mojito nature ou aromatisé</w:t>
         <w:tab/>
-        <w:t>7,00 €</w:t>
+        <w:t>8,00 €</w:t>
       </w:r>
     </w:p>
     <w:p>
@@ -2325,14 +2436,6 @@
       </w:pPr>
       <w:r>
         <w:t>Sans alcool</w:t>
-      </w:r>
-    </w:p>
-    <w:p>
-      <w:pPr>
-        <w:pStyle w:val="Description"/>
-      </w:pPr>
-      <w:r>
-        <w:t>Perrier, citron vert, cassonade, sirop de canne, feuilles de menthe, purée de fruit si aromatisé</w:t>
       </w:r>
     </w:p>
     <w:p>
@@ -2345,7 +2448,7 @@
       <w:r>
         <w:t>Virgin Colada</w:t>
         <w:tab/>
-        <w:t>7,00 €</w:t>
+        <w:t>8,00 €</w:t>
       </w:r>
     </w:p>
     <w:p>
@@ -2374,7 +2477,7 @@
       <w:r>
         <w:t>Le Ginger</w:t>
         <w:tab/>
-        <w:t>7,00 €</w:t>
+        <w:t>8,00 €</w:t>
       </w:r>
     </w:p>
     <w:p>
@@ -2403,7 +2506,7 @@
       <w:r>
         <w:t>Le Basil Fields Forever</w:t>
         <w:tab/>
-        <w:t>7,00 €</w:t>
+        <w:t>8,00 €</w:t>
       </w:r>
     </w:p>
     <w:p>
@@ -2453,15 +2556,35 @@
     </w:p>
     <w:p>
       <w:pPr>
+        <w:pStyle w:val="Heading2"/>
+      </w:pPr>
+      <w:r>
+        <w:t>Softs</w:t>
+      </w:r>
+    </w:p>
+    <w:p>
+      <w:pPr>
+        <w:pStyle w:val="Formats"/>
+        <w:tabs>
+          <w:tab w:pos="9638" w:val="right"/>
+        </w:tabs>
+      </w:pPr>
+      <w:r>
+        <w:tab/>
+        <w:t>Prix</w:t>
+      </w:r>
+    </w:p>
+    <w:p>
+      <w:pPr>
         <w:pStyle w:val="Article"/>
         <w:tabs>
           <w:tab w:pos="9638" w:val="right"/>
         </w:tabs>
       </w:pPr>
       <w:r>
-        <w:t>Création sans alcool sur demande</w:t>
+        <w:t>Bière sans alcool</w:t>
         <w:tab/>
-        <w:t>8,00 €</w:t>
+        <w:t>5,00 €</w:t>
       </w:r>
     </w:p>
     <w:p>
@@ -2470,26 +2593,6 @@
       </w:pPr>
       <w:r>
         <w:t>Sans alcool</w:t>
-      </w:r>
-    </w:p>
-    <w:p>
-      <w:pPr>
-        <w:pStyle w:val="Heading2"/>
-      </w:pPr>
-      <w:r>
-        <w:t>Softs</w:t>
-      </w:r>
-    </w:p>
-    <w:p>
-      <w:pPr>
-        <w:pStyle w:val="Formats"/>
-        <w:tabs>
-          <w:tab w:pos="9638" w:val="right"/>
-        </w:tabs>
-      </w:pPr>
-      <w:r>
-        <w:tab/>
-        <w:t>Prix</w:t>
       </w:r>
     </w:p>
     <w:p>
@@ -2500,9 +2603,9 @@
         </w:tabs>
       </w:pPr>
       <w:r>
-        <w:t>Bière sans alcool</w:t>
+        <w:t>Jus de fruits, Coca-Cola, Coca-Cola Zero, Fuze Tea, limonade, ginger beer, Perrier</w:t>
         <w:tab/>
-        <w:t>5,50 €</w:t>
+        <w:t>4,00 €</w:t>
       </w:r>
     </w:p>
     <w:p>
@@ -2521,9 +2624,9 @@
         </w:tabs>
       </w:pPr>
       <w:r>
-        <w:t>Jus de fruits, Coca-Cola, Coca-Cola Zero, Fuze Tea, limonade, ginger beer, Perrier</w:t>
+        <w:t>Sirops</w:t>
         <w:tab/>
-        <w:t>4,00 €</w:t>
+        <w:t>2,50 €</w:t>
       </w:r>
     </w:p>
     <w:p>
@@ -2542,7 +2645,7 @@
         </w:tabs>
       </w:pPr>
       <w:r>
-        <w:t>Sirops</w:t>
+        <w:t>Thé / infusion</w:t>
         <w:tab/>
         <w:t>2,50 €</w:t>
       </w:r>
@@ -2563,27 +2666,6 @@
         </w:tabs>
       </w:pPr>
       <w:r>
-        <w:t>Thé / infusion</w:t>
-        <w:tab/>
-        <w:t>2,50 €</w:t>
-      </w:r>
-    </w:p>
-    <w:p>
-      <w:pPr>
-        <w:pStyle w:val="Labels"/>
-      </w:pPr>
-      <w:r>
-        <w:t>Sans alcool</w:t>
-      </w:r>
-    </w:p>
-    <w:p>
-      <w:pPr>
-        <w:pStyle w:val="Article"/>
-        <w:tabs>
-          <w:tab w:pos="9638" w:val="right"/>
-        </w:tabs>
-      </w:pPr>
-      <w:r>
         <w:t>Café (expresso, allongé ou décaféiné)</w:t>
         <w:tab/>
         <w:t>2,00 €</w:t>
@@ -2595,19 +2677,6 @@
       </w:pPr>
       <w:r>
         <w:t>Sans alcool</w:t>
-      </w:r>
-    </w:p>
-    <w:p>
-      <w:pPr>
-        <w:pStyle w:val="Article"/>
-        <w:tabs>
-          <w:tab w:pos="9638" w:val="right"/>
-        </w:tabs>
-      </w:pPr>
-      <w:r>
-        <w:t>Supplément sirop</w:t>
-        <w:tab/>
-        <w:t>0,50 €</w:t>
       </w:r>
     </w:p>
     <w:p>
@@ -2718,7 +2787,7 @@
         <w:pStyle w:val="Composition"/>
       </w:pPr>
       <w:r>
-        <w:t>– Saucisson ibérique ; provenance Salamanca</w:t>
+        <w:t>– Coppa ; provenance Navarcles</w:t>
       </w:r>
     </w:p>
     <w:p>
@@ -2726,7 +2795,7 @@
         <w:pStyle w:val="Composition"/>
       </w:pPr>
       <w:r>
-        <w:t>– Coppa ; provenance Navarcles</w:t>
+        <w:t>– Sobrasada de Mallorca douce</w:t>
       </w:r>
     </w:p>
     <w:p>
@@ -2734,7 +2803,7 @@
         <w:pStyle w:val="Composition"/>
       </w:pPr>
       <w:r>
-        <w:t>– Sobrasada de Mallorca douce</w:t>
+        <w:t>– Chorizo grillé ; provenance Vic</w:t>
       </w:r>
     </w:p>
     <w:p>
@@ -2742,7 +2811,7 @@
         <w:pStyle w:val="Composition"/>
       </w:pPr>
       <w:r>
-        <w:t>– Chorizo grillé ; provenance Vic</w:t>
+        <w:t>– AOP Comté de Montagne 5 à 7 mois d’affinage ; provenance Jura</w:t>
       </w:r>
     </w:p>
     <w:p>
@@ -2750,7 +2819,7 @@
         <w:pStyle w:val="Composition"/>
       </w:pPr>
       <w:r>
-        <w:t>– AOP Comté de Montagne 5 à 7 mois d’affinage ; provenance Jura</w:t>
+        <w:t>– Cabécou Cabri d’Oc ; provenance Tarn</w:t>
       </w:r>
     </w:p>
     <w:p>
@@ -2758,7 +2827,7 @@
         <w:pStyle w:val="Composition"/>
       </w:pPr>
       <w:r>
-        <w:t>– AOP Fourme d’Ambert ; provenance Auvergne</w:t>
+        <w:t>– AOP Tête de Moine ; provenance Suisse</w:t>
       </w:r>
     </w:p>
     <w:p>
@@ -2766,7 +2835,7 @@
         <w:pStyle w:val="Composition"/>
       </w:pPr>
       <w:r>
-        <w:t>– Cabécou Cabri d’Oc ; provenance Tarn</w:t>
+        <w:t>– Tomme à l’ail des ours</w:t>
       </w:r>
     </w:p>
     <w:p>
@@ -2774,7 +2843,7 @@
         <w:pStyle w:val="Composition"/>
       </w:pPr>
       <w:r>
-        <w:t>– AOP Tête de Moine ; provenance Suisse</w:t>
+        <w:t>– Brie à la truffe</w:t>
       </w:r>
     </w:p>
     <w:p>
@@ -2871,7 +2940,7 @@
         <w:pStyle w:val="Description"/>
       </w:pPr>
       <w:r>
-        <w:t>Servis avec sauce bravas et chutney de menthe</w:t>
+        <w:t>Supplément frites : 2,00 €</w:t>
       </w:r>
     </w:p>
     <w:p>
@@ -2904,14 +2973,6 @@
       </w:pPr>
       <w:r>
         <w:t>– Onion rings</w:t>
-      </w:r>
-    </w:p>
-    <w:p>
-      <w:pPr>
-        <w:pStyle w:val="Composition"/>
-      </w:pPr>
-      <w:r>
-        <w:t>– Potatoes</w:t>
       </w:r>
     </w:p>
     <w:p>
@@ -3042,7 +3103,7 @@
         </w:tabs>
       </w:pPr>
       <w:r>
-        <w:t>Jambon Duroc affiné 24 mois ou plus</w:t>
+        <w:t>Jambon Duroc affiné 24 mois</w:t>
         <w:tab/>
         <w:t>7,50 €</w:t>
       </w:r>
@@ -3126,9 +3187,9 @@
         </w:tabs>
       </w:pPr>
       <w:r>
-        <w:t>Œuf cocotte</w:t>
+        <w:t>Ramequin de tartinade au choix</w:t>
         <w:tab/>
-        <w:t>6,50 €</w:t>
+        <w:t>4,50 €</w:t>
       </w:r>
     </w:p>
     <w:p>
@@ -3137,6 +3198,14 @@
       </w:pPr>
       <w:r>
         <w:t>Fait maison</w:t>
+      </w:r>
+    </w:p>
+    <w:p>
+      <w:pPr>
+        <w:pStyle w:val="Description"/>
+      </w:pPr>
+      <w:r>
+        <w:t>Tomatade, guacamole, pan con tomate ou caviar d’aubergine</w:t>
       </w:r>
     </w:p>
     <w:p>
@@ -3147,9 +3216,9 @@
         </w:tabs>
       </w:pPr>
       <w:r>
-        <w:t>Guacamole</w:t>
+        <w:t>Pain à l’ail</w:t>
         <w:tab/>
-        <w:t>4,50 €</w:t>
+        <w:t>4,00 €</w:t>
       </w:r>
     </w:p>
     <w:p>
@@ -3158,6 +3227,26 @@
       </w:pPr>
       <w:r>
         <w:t>Fait maison</w:t>
+      </w:r>
+    </w:p>
+    <w:p>
+      <w:pPr>
+        <w:pStyle w:val="Heading1"/>
+      </w:pPr>
+      <w:r>
+        <w:t>Fingerfood</w:t>
+      </w:r>
+    </w:p>
+    <w:p>
+      <w:pPr>
+        <w:pStyle w:val="Formats"/>
+        <w:tabs>
+          <w:tab w:pos="9638" w:val="right"/>
+        </w:tabs>
+      </w:pPr>
+      <w:r>
+        <w:tab/>
+        <w:t>Prix</w:t>
       </w:r>
     </w:p>
     <w:p>
@@ -3168,45 +3257,9 @@
         </w:tabs>
       </w:pPr>
       <w:r>
-        <w:t>Garlic bread</w:t>
+        <w:t>Chicken wings</w:t>
         <w:tab/>
-        <w:t>4,00 €</w:t>
-      </w:r>
-    </w:p>
-    <w:p>
-      <w:pPr>
-        <w:pStyle w:val="Labels"/>
-      </w:pPr>
-      <w:r>
-        <w:t>Fait maison</w:t>
-      </w:r>
-    </w:p>
-    <w:p>
-      <w:pPr>
-        <w:pStyle w:val="Heading1"/>
-      </w:pPr>
-      <w:r>
-        <w:t>Fingerfood</w:t>
-      </w:r>
-    </w:p>
-    <w:p>
-      <w:pPr>
-        <w:pStyle w:val="Note"/>
-      </w:pPr>
-      <w:r>
-        <w:t>Servis avec une sauce bravas ou un chutney de menthe.</w:t>
-      </w:r>
-    </w:p>
-    <w:p>
-      <w:pPr>
-        <w:pStyle w:val="Formats"/>
-        <w:tabs>
-          <w:tab w:pos="9638" w:val="right"/>
-        </w:tabs>
-      </w:pPr>
-      <w:r>
-        <w:tab/>
-        <w:t>Prix</w:t>
+        <w:t>8,00 €</w:t>
       </w:r>
     </w:p>
     <w:p>
@@ -3217,9 +3270,9 @@
         </w:tabs>
       </w:pPr>
       <w:r>
-        <w:t>Chicken wings</w:t>
+        <w:t>Onion rings</w:t>
         <w:tab/>
-        <w:t>8,00 €</w:t>
+        <w:t>6,00 €</w:t>
       </w:r>
     </w:p>
     <w:p>
@@ -3230,7 +3283,7 @@
         </w:tabs>
       </w:pPr>
       <w:r>
-        <w:t>Onion rings</w:t>
+        <w:t>Mozzarella sticks</w:t>
         <w:tab/>
         <w:t>6,00 €</w:t>
       </w:r>
@@ -3243,7 +3296,7 @@
         </w:tabs>
       </w:pPr>
       <w:r>
-        <w:t>Mozzarella sticks</w:t>
+        <w:t>Beignets de calamars</w:t>
         <w:tab/>
         <w:t>6,00 €</w:t>
       </w:r>
@@ -3256,22 +3309,9 @@
         </w:tabs>
       </w:pPr>
       <w:r>
-        <w:t>Beignets de calamars</w:t>
+        <w:t>Frites</w:t>
         <w:tab/>
-        <w:t>6,00 €</w:t>
-      </w:r>
-    </w:p>
-    <w:p>
-      <w:pPr>
-        <w:pStyle w:val="Article"/>
-        <w:tabs>
-          <w:tab w:pos="9638" w:val="right"/>
-        </w:tabs>
-      </w:pPr>
-      <w:r>
-        <w:t>Potatoes</w:t>
-        <w:tab/>
-        <w:t>5,50 €</w:t>
+        <w:t>5,00 €</w:t>
       </w:r>
     </w:p>
     <w:p>

</xml_diff>

<commit_message>
Carte du 01/11/2026 remise au format du modèle
Co-Authored-By: Claude Opus 5.5 <noreply@anthropic.com>
Claude-Session: https://claude.ai/code/session_016TsXrNnekg5BR35cuJtvC3
</commit_message>
<xml_diff>
--- a/MENU/Carte Clandestin - modele.docx
+++ b/MENU/Carte Clandestin - modele.docx
@@ -499,6 +499,14 @@
     </w:p>
     <w:p>
       <w:pPr>
+        <w:pStyle w:val="Labels"/>
+      </w:pPr>
+      <w:r>
+        <w:t>HVE</w:t>
+      </w:r>
+    </w:p>
+    <w:p>
+      <w:pPr>
         <w:pStyle w:val="Appellation"/>
       </w:pPr>
       <w:r>
@@ -1487,23 +1495,287 @@
     </w:p>
     <w:p>
       <w:pPr>
+        <w:pStyle w:val="Heading2"/>
+      </w:pPr>
+      <w:r>
+        <w:t>Classiques</w:t>
+      </w:r>
+    </w:p>
+    <w:p>
+      <w:pPr>
+        <w:pStyle w:val="Formats"/>
+        <w:tabs>
+          <w:tab w:pos="9638" w:val="right"/>
+        </w:tabs>
+      </w:pPr>
+      <w:r>
+        <w:tab/>
+        <w:t>Prix</w:t>
+      </w:r>
+    </w:p>
+    <w:p>
+      <w:pPr>
         <w:pStyle w:val="Article"/>
         <w:tabs>
           <w:tab w:pos="9638" w:val="right"/>
         </w:tabs>
       </w:pPr>
       <w:r>
-        <w:t>Cocktail création sur demande</w:t>
+        <w:t>Jägerbomb</w:t>
+        <w:tab/>
+        <w:t>6,00 €</w:t>
+      </w:r>
+    </w:p>
+    <w:p>
+      <w:pPr>
+        <w:pStyle w:val="Article"/>
+        <w:tabs>
+          <w:tab w:pos="9638" w:val="right"/>
+        </w:tabs>
+      </w:pPr>
+      <w:r>
+        <w:t>Ti’Punch</w:t>
+        <w:tab/>
+        <w:t>9,00 €</w:t>
+      </w:r>
+    </w:p>
+    <w:p>
+      <w:pPr>
+        <w:pStyle w:val="Description"/>
+      </w:pPr>
+      <w:r>
+        <w:t>Rhum agricole, citron vert, cassonade, sirop de canne</w:t>
+      </w:r>
+    </w:p>
+    <w:p>
+      <w:pPr>
+        <w:pStyle w:val="Article"/>
+        <w:tabs>
+          <w:tab w:pos="9638" w:val="right"/>
+        </w:tabs>
+      </w:pPr>
+      <w:r>
+        <w:t>Green Stormy</w:t>
+        <w:tab/>
+        <w:t>9,00 €</w:t>
+      </w:r>
+    </w:p>
+    <w:p>
+      <w:pPr>
+        <w:pStyle w:val="Description"/>
+      </w:pPr>
+      <w:r>
+        <w:t>Rhum ambré, ginger ale, jus de citron vert, sirop basilic</w:t>
+      </w:r>
+    </w:p>
+    <w:p>
+      <w:pPr>
+        <w:pStyle w:val="Article"/>
+        <w:tabs>
+          <w:tab w:pos="9638" w:val="right"/>
+        </w:tabs>
+      </w:pPr>
+      <w:r>
+        <w:t>Moscow Mule</w:t>
+        <w:tab/>
+        <w:t>9,00 €</w:t>
+      </w:r>
+    </w:p>
+    <w:p>
+      <w:pPr>
+        <w:pStyle w:val="Description"/>
+      </w:pPr>
+      <w:r>
+        <w:t>Vodka, ginger ale, citron vert, menthe fraîche</w:t>
+      </w:r>
+    </w:p>
+    <w:p>
+      <w:pPr>
+        <w:pStyle w:val="Article"/>
+        <w:tabs>
+          <w:tab w:pos="9638" w:val="right"/>
+        </w:tabs>
+      </w:pPr>
+      <w:r>
+        <w:t>Espresso Martini</w:t>
+        <w:tab/>
+        <w:t>9,00 €</w:t>
+      </w:r>
+    </w:p>
+    <w:p>
+      <w:pPr>
+        <w:pStyle w:val="Description"/>
+      </w:pPr>
+      <w:r>
+        <w:t>Vodka, liqueur de café, espresso</w:t>
+      </w:r>
+    </w:p>
+    <w:p>
+      <w:pPr>
+        <w:pStyle w:val="Article"/>
+        <w:tabs>
+          <w:tab w:pos="9638" w:val="right"/>
+        </w:tabs>
+      </w:pPr>
+      <w:r>
+        <w:t>Mojito nature ou aromatisé</w:t>
+        <w:tab/>
+        <w:t>10,00 €</w:t>
+      </w:r>
+    </w:p>
+    <w:p>
+      <w:pPr>
+        <w:pStyle w:val="Description"/>
+      </w:pPr>
+      <w:r>
+        <w:t>Arômes au choix : fraise, framboise, passion ou mangue. Rhum ambré, citron vert, cassonade, sirop de canne, Perrier, feuilles de menthe, purée de fruit si aromatisé</w:t>
+      </w:r>
+    </w:p>
+    <w:p>
+      <w:pPr>
+        <w:pStyle w:val="Article"/>
+        <w:tabs>
+          <w:tab w:pos="9638" w:val="right"/>
+        </w:tabs>
+      </w:pPr>
+      <w:r>
+        <w:t>Frozen Daïquiri aromatisé</w:t>
+        <w:tab/>
+        <w:t>10,00 €</w:t>
+      </w:r>
+    </w:p>
+    <w:p>
+      <w:pPr>
+        <w:pStyle w:val="Description"/>
+      </w:pPr>
+      <w:r>
+        <w:t>Arômes au choix : fraise, framboise, passion ou mangue. Rhum ambré, jus de citron vert, cassonade, sirop de canne, purée de fruit</w:t>
+      </w:r>
+    </w:p>
+    <w:p>
+      <w:pPr>
+        <w:pStyle w:val="Article"/>
+        <w:tabs>
+          <w:tab w:pos="9638" w:val="right"/>
+        </w:tabs>
+      </w:pPr>
+      <w:r>
+        <w:t>Piña Colada</w:t>
+        <w:tab/>
+        <w:t>10,00 €</w:t>
+      </w:r>
+    </w:p>
+    <w:p>
+      <w:pPr>
+        <w:pStyle w:val="Description"/>
+      </w:pPr>
+      <w:r>
+        <w:t>Rhum ambré, jus d’ananas, jus de banane, sirop de coco</w:t>
+      </w:r>
+    </w:p>
+    <w:p>
+      <w:pPr>
+        <w:pStyle w:val="Article"/>
+        <w:tabs>
+          <w:tab w:pos="9638" w:val="right"/>
+        </w:tabs>
+      </w:pPr>
+      <w:r>
+        <w:t>Negroni</w:t>
+        <w:tab/>
+        <w:t>10,00 €</w:t>
+      </w:r>
+    </w:p>
+    <w:p>
+      <w:pPr>
+        <w:pStyle w:val="Description"/>
+      </w:pPr>
+      <w:r>
+        <w:t>Gin, Campari, Martini Rosso, zeste d’orange</w:t>
+      </w:r>
+    </w:p>
+    <w:p>
+      <w:pPr>
+        <w:pStyle w:val="Article"/>
+        <w:tabs>
+          <w:tab w:pos="9638" w:val="right"/>
+        </w:tabs>
+      </w:pPr>
+      <w:r>
+        <w:t>Whisky Smash</w:t>
+        <w:tab/>
+        <w:t>10,00 €</w:t>
+      </w:r>
+    </w:p>
+    <w:p>
+      <w:pPr>
+        <w:pStyle w:val="Description"/>
+      </w:pPr>
+      <w:r>
+        <w:t>Bulleit Bourbon, feuilles de menthe, sirop de sucre, citron jaune</w:t>
+      </w:r>
+    </w:p>
+    <w:p>
+      <w:pPr>
+        <w:pStyle w:val="Article"/>
+        <w:tabs>
+          <w:tab w:pos="9638" w:val="right"/>
+        </w:tabs>
+      </w:pPr>
+      <w:r>
+        <w:t>Gin &amp; Tonic</w:t>
+        <w:tab/>
+        <w:t>10,00 €</w:t>
+      </w:r>
+    </w:p>
+    <w:p>
+      <w:pPr>
+        <w:pStyle w:val="Article"/>
+        <w:tabs>
+          <w:tab w:pos="9638" w:val="right"/>
+        </w:tabs>
+      </w:pPr>
+      <w:r>
+        <w:t>Gin &amp; Tonic Premium</w:t>
         <w:tab/>
         <w:t>12,00 €</w:t>
       </w:r>
     </w:p>
     <w:p>
       <w:pPr>
+        <w:pStyle w:val="Description"/>
+      </w:pPr>
+      <w:r>
+        <w:t>Gin au choix, tonic Fever-Tree</w:t>
+      </w:r>
+    </w:p>
+    <w:p>
+      <w:pPr>
+        <w:pStyle w:val="Article"/>
+        <w:tabs>
+          <w:tab w:pos="9638" w:val="right"/>
+        </w:tabs>
+      </w:pPr>
+      <w:r>
+        <w:t>Old Fashioned</w:t>
+        <w:tab/>
+        <w:t>12,00 €</w:t>
+      </w:r>
+    </w:p>
+    <w:p>
+      <w:pPr>
+        <w:pStyle w:val="Description"/>
+      </w:pPr>
+      <w:r>
+        <w:t>Balvenie, sucre, Perrier, Angostura</w:t>
+      </w:r>
+    </w:p>
+    <w:p>
+      <w:pPr>
         <w:pStyle w:val="Heading2"/>
       </w:pPr>
       <w:r>
-        <w:t>Classiques</w:t>
+        <w:t>Spritz</w:t>
       </w:r>
     </w:p>
     <w:p>
@@ -1526,9 +1798,17 @@
         </w:tabs>
       </w:pPr>
       <w:r>
-        <w:t>Jägerbomb</w:t>
+        <w:t>Spritz liqueur au choix</w:t>
         <w:tab/>
-        <w:t>6,00 €</w:t>
+        <w:t>9,00 €</w:t>
+      </w:r>
+    </w:p>
+    <w:p>
+      <w:pPr>
+        <w:pStyle w:val="Description"/>
+      </w:pPr>
+      <w:r>
+        <w:t>Aperol, Campari, mangue, vanille, cassis, citron, orange, limoncello…</w:t>
       </w:r>
     </w:p>
     <w:p>
@@ -1539,17 +1819,29 @@
         </w:tabs>
       </w:pPr>
       <w:r>
-        <w:t>Ti’Punch</w:t>
+        <w:t>St Germain Spritz</w:t>
         <w:tab/>
-        <w:t>9,00 €</w:t>
-      </w:r>
-    </w:p>
-    <w:p>
-      <w:pPr>
-        <w:pStyle w:val="Description"/>
-      </w:pPr>
-      <w:r>
-        <w:t>Rhum agricole, citron vert, cassonade, sirop de canne</w:t>
+        <w:t>12,00 €</w:t>
+      </w:r>
+    </w:p>
+    <w:p>
+      <w:pPr>
+        <w:pStyle w:val="Heading1"/>
+      </w:pPr>
+      <w:r>
+        <w:t>Liqueurs et apéritifs</w:t>
+      </w:r>
+    </w:p>
+    <w:p>
+      <w:pPr>
+        <w:pStyle w:val="Formats"/>
+        <w:tabs>
+          <w:tab w:pos="9638" w:val="right"/>
+        </w:tabs>
+      </w:pPr>
+      <w:r>
+        <w:tab/>
+        <w:t>Prix</w:t>
       </w:r>
     </w:p>
     <w:p>
@@ -1560,17 +1852,9 @@
         </w:tabs>
       </w:pPr>
       <w:r>
-        <w:t>Green Stormy</w:t>
+        <w:t>Ricard</w:t>
         <w:tab/>
-        <w:t>9,00 €</w:t>
-      </w:r>
-    </w:p>
-    <w:p>
-      <w:pPr>
-        <w:pStyle w:val="Description"/>
-      </w:pPr>
-      <w:r>
-        <w:t>Rhum ambré, ginger ale, jus de citron vert, sirop basilic</w:t>
+        <w:t>3,50 €</w:t>
       </w:r>
     </w:p>
     <w:p>
@@ -1581,17 +1865,9 @@
         </w:tabs>
       </w:pPr>
       <w:r>
-        <w:t>Moscow Mule</w:t>
+        <w:t>Limoncello</w:t>
         <w:tab/>
-        <w:t>9,00 €</w:t>
-      </w:r>
-    </w:p>
-    <w:p>
-      <w:pPr>
-        <w:pStyle w:val="Description"/>
-      </w:pPr>
-      <w:r>
-        <w:t>Vodka, ginger ale, citron vert, menthe fraîche</w:t>
+        <w:t>5,00 €</w:t>
       </w:r>
     </w:p>
     <w:p>
@@ -1602,17 +1878,9 @@
         </w:tabs>
       </w:pPr>
       <w:r>
-        <w:t>Espresso Martini</w:t>
+        <w:t>Get 27</w:t>
         <w:tab/>
-        <w:t>9,00 €</w:t>
-      </w:r>
-    </w:p>
-    <w:p>
-      <w:pPr>
-        <w:pStyle w:val="Description"/>
-      </w:pPr>
-      <w:r>
-        <w:t>Vodka, liqueur de café, espresso</w:t>
+        <w:t>5,50 €</w:t>
       </w:r>
     </w:p>
     <w:p>
@@ -1623,17 +1891,9 @@
         </w:tabs>
       </w:pPr>
       <w:r>
-        <w:t>Mojito nature ou aromatisé</w:t>
+        <w:t>Baileys Irish Cream</w:t>
         <w:tab/>
-        <w:t>10,00 €</w:t>
-      </w:r>
-    </w:p>
-    <w:p>
-      <w:pPr>
-        <w:pStyle w:val="Description"/>
-      </w:pPr>
-      <w:r>
-        <w:t>Arômes au choix : fraise, framboise, passion ou mangue. Rhum ambré, citron vert, cassonade, sirop de canne, Perrier, feuilles de menthe, purée de fruit si aromatisé</w:t>
+        <w:t>5,50 €</w:t>
       </w:r>
     </w:p>
     <w:p>
@@ -1644,17 +1904,9 @@
         </w:tabs>
       </w:pPr>
       <w:r>
-        <w:t>Frozen Daïquiri aromatisé</w:t>
+        <w:t>Martini</w:t>
         <w:tab/>
-        <w:t>10,00 €</w:t>
-      </w:r>
-    </w:p>
-    <w:p>
-      <w:pPr>
-        <w:pStyle w:val="Description"/>
-      </w:pPr>
-      <w:r>
-        <w:t>Arômes au choix : fraise, framboise, passion ou mangue. Rhum ambré, jus de citron vert, cassonade, sirop de canne, purée de fruit</w:t>
+        <w:t>5,50 €</w:t>
       </w:r>
     </w:p>
     <w:p>
@@ -1665,17 +1917,37 @@
         </w:tabs>
       </w:pPr>
       <w:r>
-        <w:t>Piña Colada</w:t>
+        <w:t>Irish Coffee</w:t>
         <w:tab/>
-        <w:t>10,00 €</w:t>
-      </w:r>
-    </w:p>
-    <w:p>
-      <w:pPr>
-        <w:pStyle w:val="Description"/>
-      </w:pPr>
-      <w:r>
-        <w:t>Rhum ambré, jus d’ananas, jus de banane, sirop de coco</w:t>
+        <w:t>7,00 €</w:t>
+      </w:r>
+    </w:p>
+    <w:p>
+      <w:pPr>
+        <w:pStyle w:val="Heading1"/>
+      </w:pPr>
+      <w:r>
+        <w:t>Spiritueux</w:t>
+      </w:r>
+    </w:p>
+    <w:p>
+      <w:pPr>
+        <w:pStyle w:val="Heading2"/>
+      </w:pPr>
+      <w:r>
+        <w:t>Whisky</w:t>
+      </w:r>
+    </w:p>
+    <w:p>
+      <w:pPr>
+        <w:pStyle w:val="Formats"/>
+        <w:tabs>
+          <w:tab w:pos="9638" w:val="right"/>
+        </w:tabs>
+      </w:pPr>
+      <w:r>
+        <w:tab/>
+        <w:t>Prix</w:t>
       </w:r>
     </w:p>
     <w:p>
@@ -1686,17 +1958,9 @@
         </w:tabs>
       </w:pPr>
       <w:r>
-        <w:t>Negroni</w:t>
+        <w:t>Bulleit Bourbon – 45°</w:t>
         <w:tab/>
         <w:t>10,00 €</w:t>
-      </w:r>
-    </w:p>
-    <w:p>
-      <w:pPr>
-        <w:pStyle w:val="Description"/>
-      </w:pPr>
-      <w:r>
-        <w:t>Gin, Campari, Martini Rosso, zeste d’orange</w:t>
       </w:r>
     </w:p>
     <w:p>
@@ -1707,7 +1971,7 @@
         </w:tabs>
       </w:pPr>
       <w:r>
-        <w:t>Whisky Smash</w:t>
+        <w:t>Monkey Shoulder – 40°</w:t>
         <w:tab/>
         <w:t>10,00 €</w:t>
       </w:r>
@@ -1717,7 +1981,7 @@
         <w:pStyle w:val="Description"/>
       </w:pPr>
       <w:r>
-        <w:t>Bulleit Bourbon, feuilles de menthe, sirop de sucre, citron jaune</w:t>
+        <w:t>Original ou Smokey</w:t>
       </w:r>
     </w:p>
     <w:p>
@@ -1728,7 +1992,7 @@
         </w:tabs>
       </w:pPr>
       <w:r>
-        <w:t>Gin &amp; Tonic</w:t>
+        <w:t>Tullamore Dew – 40°</w:t>
         <w:tab/>
         <w:t>10,00 €</w:t>
       </w:r>
@@ -1741,17 +2005,9 @@
         </w:tabs>
       </w:pPr>
       <w:r>
-        <w:t>Gin &amp; Tonic Premium</w:t>
+        <w:t>Talisker Port Ruighe – 45,8°</w:t>
         <w:tab/>
         <w:t>12,00 €</w:t>
-      </w:r>
-    </w:p>
-    <w:p>
-      <w:pPr>
-        <w:pStyle w:val="Description"/>
-      </w:pPr>
-      <w:r>
-        <w:t>Gin au choix, tonic Fever-Tree</w:t>
       </w:r>
     </w:p>
     <w:p>
@@ -1762,17 +2018,22 @@
         </w:tabs>
       </w:pPr>
       <w:r>
-        <w:t>Old Fashioned</w:t>
+        <w:t>Balvenie 12 ans – 40°</w:t>
         <w:tab/>
         <w:t>12,00 €</w:t>
       </w:r>
     </w:p>
     <w:p>
       <w:pPr>
-        <w:pStyle w:val="Description"/>
-      </w:pPr>
-      <w:r>
-        <w:t>Glenmorangie, sucre, Perrier, Angostura</w:t>
+        <w:pStyle w:val="Article"/>
+        <w:tabs>
+          <w:tab w:pos="9638" w:val="right"/>
+        </w:tabs>
+      </w:pPr>
+      <w:r>
+        <w:t>Glenfiddich 12 ans – 40°</w:t>
+        <w:tab/>
+        <w:t>12,00 €</w:t>
       </w:r>
     </w:p>
     <w:p>
@@ -1780,7 +2041,7 @@
         <w:pStyle w:val="Heading2"/>
       </w:pPr>
       <w:r>
-        <w:t>Spritz</w:t>
+        <w:t>Gin</w:t>
       </w:r>
     </w:p>
     <w:p>
@@ -1803,228 +2064,17 @@
         </w:tabs>
       </w:pPr>
       <w:r>
-        <w:t>Spritz liqueur au choix</w:t>
-        <w:tab/>
-        <w:t>9,00 €</w:t>
-      </w:r>
-    </w:p>
-    <w:p>
-      <w:pPr>
-        <w:pStyle w:val="Description"/>
-      </w:pPr>
-      <w:r>
-        <w:t>Aperol, Campari, mangue, vanille, cassis, citron, orange, limoncello…</w:t>
-      </w:r>
-    </w:p>
-    <w:p>
-      <w:pPr>
-        <w:pStyle w:val="Article"/>
-        <w:tabs>
-          <w:tab w:pos="9638" w:val="right"/>
-        </w:tabs>
-      </w:pPr>
-      <w:r>
-        <w:t>St Germain Spritz</w:t>
-        <w:tab/>
-        <w:t>12,00 €</w:t>
-      </w:r>
-    </w:p>
-    <w:p>
-      <w:pPr>
-        <w:pStyle w:val="Heading1"/>
-      </w:pPr>
-      <w:r>
-        <w:t>Liqueurs et apéritifs</w:t>
-      </w:r>
-    </w:p>
-    <w:p>
-      <w:pPr>
-        <w:pStyle w:val="Formats"/>
-        <w:tabs>
-          <w:tab w:pos="9638" w:val="right"/>
-        </w:tabs>
-      </w:pPr>
-      <w:r>
-        <w:tab/>
-        <w:t>Prix</w:t>
-      </w:r>
-    </w:p>
-    <w:p>
-      <w:pPr>
-        <w:pStyle w:val="Article"/>
-        <w:tabs>
-          <w:tab w:pos="9638" w:val="right"/>
-        </w:tabs>
-      </w:pPr>
-      <w:r>
-        <w:t>Ricard</w:t>
-        <w:tab/>
-        <w:t>3,50 €</w:t>
-      </w:r>
-    </w:p>
-    <w:p>
-      <w:pPr>
-        <w:pStyle w:val="Article"/>
-        <w:tabs>
-          <w:tab w:pos="9638" w:val="right"/>
-        </w:tabs>
-      </w:pPr>
-      <w:r>
-        <w:t>Limoncello</w:t>
-        <w:tab/>
-        <w:t>5,00 €</w:t>
-      </w:r>
-    </w:p>
-    <w:p>
-      <w:pPr>
-        <w:pStyle w:val="Article"/>
-        <w:tabs>
-          <w:tab w:pos="9638" w:val="right"/>
-        </w:tabs>
-      </w:pPr>
-      <w:r>
-        <w:t>Get 27</w:t>
-        <w:tab/>
-        <w:t>5,50 €</w:t>
-      </w:r>
-    </w:p>
-    <w:p>
-      <w:pPr>
-        <w:pStyle w:val="Article"/>
-        <w:tabs>
-          <w:tab w:pos="9638" w:val="right"/>
-        </w:tabs>
-      </w:pPr>
-      <w:r>
-        <w:t>Baileys Irish Cream</w:t>
-        <w:tab/>
-        <w:t>5,50 €</w:t>
-      </w:r>
-    </w:p>
-    <w:p>
-      <w:pPr>
-        <w:pStyle w:val="Article"/>
-        <w:tabs>
-          <w:tab w:pos="9638" w:val="right"/>
-        </w:tabs>
-      </w:pPr>
-      <w:r>
-        <w:t>Martini</w:t>
-        <w:tab/>
-        <w:t>5,50 €</w:t>
-      </w:r>
-    </w:p>
-    <w:p>
-      <w:pPr>
-        <w:pStyle w:val="Heading1"/>
-      </w:pPr>
-      <w:r>
-        <w:t>Spiritueux</w:t>
-      </w:r>
-    </w:p>
-    <w:p>
-      <w:pPr>
-        <w:pStyle w:val="Heading2"/>
-      </w:pPr>
-      <w:r>
-        <w:t>Whisky</w:t>
-      </w:r>
-    </w:p>
-    <w:p>
-      <w:pPr>
-        <w:pStyle w:val="Formats"/>
-        <w:tabs>
-          <w:tab w:pos="9638" w:val="right"/>
-        </w:tabs>
-      </w:pPr>
-      <w:r>
-        <w:tab/>
-        <w:t>Prix</w:t>
-      </w:r>
-    </w:p>
-    <w:p>
-      <w:pPr>
-        <w:pStyle w:val="Article"/>
-        <w:tabs>
-          <w:tab w:pos="9638" w:val="right"/>
-        </w:tabs>
-      </w:pPr>
-      <w:r>
-        <w:t>Bulleit Bourbon – 45°</w:t>
-        <w:tab/>
-        <w:t>10,00 €</w:t>
-      </w:r>
-    </w:p>
-    <w:p>
-      <w:pPr>
-        <w:pStyle w:val="Article"/>
-        <w:tabs>
-          <w:tab w:pos="9638" w:val="right"/>
-        </w:tabs>
-      </w:pPr>
-      <w:r>
-        <w:t>Monkey Shoulder – 40°</w:t>
-        <w:tab/>
-        <w:t>10,00 €</w:t>
-      </w:r>
-    </w:p>
-    <w:p>
-      <w:pPr>
-        <w:pStyle w:val="Article"/>
-        <w:tabs>
-          <w:tab w:pos="9638" w:val="right"/>
-        </w:tabs>
-      </w:pPr>
-      <w:r>
-        <w:t>Tullamore Dew – 40°</w:t>
-        <w:tab/>
-        <w:t>10,00 €</w:t>
-      </w:r>
-    </w:p>
-    <w:p>
-      <w:pPr>
-        <w:pStyle w:val="Article"/>
-        <w:tabs>
-          <w:tab w:pos="9638" w:val="right"/>
-        </w:tabs>
-      </w:pPr>
-      <w:r>
-        <w:t>Talisker Port Ruighe – 45,8°</w:t>
-        <w:tab/>
-        <w:t>12,00 €</w:t>
-      </w:r>
-    </w:p>
-    <w:p>
-      <w:pPr>
-        <w:pStyle w:val="Heading2"/>
-      </w:pPr>
-      <w:r>
-        <w:t>Gin</w:t>
-      </w:r>
-    </w:p>
-    <w:p>
-      <w:pPr>
-        <w:pStyle w:val="Formats"/>
-        <w:tabs>
-          <w:tab w:pos="9638" w:val="right"/>
-        </w:tabs>
-      </w:pPr>
-      <w:r>
-        <w:tab/>
-        <w:t>Prix</w:t>
-      </w:r>
-    </w:p>
-    <w:p>
-      <w:pPr>
-        <w:pStyle w:val="Article"/>
-        <w:tabs>
-          <w:tab w:pos="9638" w:val="right"/>
-        </w:tabs>
-      </w:pPr>
-      <w:r>
         <w:t>Hendrick’s – 41,4°</w:t>
         <w:tab/>
         <w:t>10,00 €</w:t>
+      </w:r>
+    </w:p>
+    <w:p>
+      <w:pPr>
+        <w:pStyle w:val="Description"/>
+      </w:pPr>
+      <w:r>
+        <w:t>Original ou Another</w:t>
       </w:r>
     </w:p>
     <w:p>
@@ -2556,6 +2606,35 @@
     </w:p>
     <w:p>
       <w:pPr>
+        <w:pStyle w:val="Article"/>
+        <w:tabs>
+          <w:tab w:pos="9638" w:val="right"/>
+        </w:tabs>
+      </w:pPr>
+      <w:r>
+        <w:t>Le Pulpe Fiction</w:t>
+        <w:tab/>
+        <w:t>8,00 €</w:t>
+      </w:r>
+    </w:p>
+    <w:p>
+      <w:pPr>
+        <w:pStyle w:val="Labels"/>
+      </w:pPr>
+      <w:r>
+        <w:t>Sans alcool</w:t>
+      </w:r>
+    </w:p>
+    <w:p>
+      <w:pPr>
+        <w:pStyle w:val="Description"/>
+      </w:pPr>
+      <w:r>
+        <w:t>Purée de passion, jus de citron, jus d’ananas, jus d’orange, sirop de grenadine, Perrier</w:t>
+      </w:r>
+    </w:p>
+    <w:p>
+      <w:pPr>
         <w:pStyle w:val="Heading2"/>
       </w:pPr>
       <w:r>
@@ -2763,7 +2842,7 @@
         <w:pStyle w:val="Composition"/>
       </w:pPr>
       <w:r>
-        <w:t>– Jambon Duroc affiné 24 mois ; provenance Guijuelo</w:t>
+        <w:t>– Jambon Duroc affiné 24 mois ; provenance Guijuelo, Espagne</w:t>
       </w:r>
     </w:p>
     <w:p>
@@ -2771,7 +2850,7 @@
         <w:pStyle w:val="Composition"/>
       </w:pPr>
       <w:r>
-        <w:t>– Saucisson artisanal haché fin « Longaniza » ; provenance Navarcles</w:t>
+        <w:t>– Saucisson artisanal haché fin « Longaniza » ; provenance Navarcles, Espagne</w:t>
       </w:r>
     </w:p>
     <w:p>
@@ -2779,7 +2858,7 @@
         <w:pStyle w:val="Composition"/>
       </w:pPr>
       <w:r>
-        <w:t>– Chorizo ibérique ; provenance Salamanca</w:t>
+        <w:t>– Chorizo ibérique ; provenance Salamanca, Espagne</w:t>
       </w:r>
     </w:p>
     <w:p>
@@ -2787,7 +2866,7 @@
         <w:pStyle w:val="Composition"/>
       </w:pPr>
       <w:r>
-        <w:t>– Coppa ; provenance Navarcles</w:t>
+        <w:t>– Coppa catalane ; provenance Navarcles, Espagne</w:t>
       </w:r>
     </w:p>
     <w:p>
@@ -2795,7 +2874,7 @@
         <w:pStyle w:val="Composition"/>
       </w:pPr>
       <w:r>
-        <w:t>– Sobrasada de Mallorca douce</w:t>
+        <w:t>– Lomo ; provenance Soria, Espagne</w:t>
       </w:r>
     </w:p>
     <w:p>
@@ -2803,7 +2882,7 @@
         <w:pStyle w:val="Composition"/>
       </w:pPr>
       <w:r>
-        <w:t>– Chorizo grillé ; provenance Vic</w:t>
+        <w:t>– Chorizo grillé ; provenance Vic, Espagne</w:t>
       </w:r>
     </w:p>
     <w:p>
@@ -2835,7 +2914,7 @@
         <w:pStyle w:val="Composition"/>
       </w:pPr>
       <w:r>
-        <w:t>– Tomme à l’ail des ours</w:t>
+        <w:t>– Tomme à l’ail des ours ; provenance Jura</w:t>
       </w:r>
     </w:p>
     <w:p>
@@ -2843,7 +2922,23 @@
         <w:pStyle w:val="Composition"/>
       </w:pPr>
       <w:r>
-        <w:t>– Brie à la truffe</w:t>
+        <w:t>– Brie à la truffe ; provenance Lot-et-Garonne</w:t>
+      </w:r>
+    </w:p>
+    <w:p>
+      <w:pPr>
+        <w:pStyle w:val="Composition"/>
+      </w:pPr>
+      <w:r>
+        <w:t>– Manchego 6 mois d’affinage ; provenance Castilla-La Mancha, Espagne</w:t>
+      </w:r>
+    </w:p>
+    <w:p>
+      <w:pPr>
+        <w:pStyle w:val="Composition"/>
+      </w:pPr>
+      <w:r>
+        <w:t>– Brebis miel &amp; origan ; provenance Castilla-La Mancha, Espagne</w:t>
       </w:r>
     </w:p>
     <w:p>
@@ -3024,7 +3119,7 @@
         </w:tabs>
       </w:pPr>
       <w:r>
-        <w:t>Camembert rôti</w:t>
+        <w:t>Camembert rôti au miel et aux herbes</w:t>
         <w:tab/>
         <w:t>10,00 €</w:t>
       </w:r>
@@ -3074,9 +3169,9 @@
         </w:tabs>
       </w:pPr>
       <w:r>
-        <w:t>Burrata</w:t>
+        <w:t>Jambon Duroc affiné 24 mois</w:t>
         <w:tab/>
-        <w:t>8,00 €</w:t>
+        <w:t>7,50 €</w:t>
       </w:r>
     </w:p>
     <w:p>
@@ -3085,14 +3180,6 @@
       </w:pPr>
       <w:r>
         <w:t>Fait maison</w:t>
-      </w:r>
-    </w:p>
-    <w:p>
-      <w:pPr>
-        <w:pStyle w:val="Description"/>
-      </w:pPr>
-      <w:r>
-        <w:t>Accompagnée de son pesto maison et de tomates cerises</w:t>
       </w:r>
     </w:p>
     <w:p>
@@ -3103,9 +3190,9 @@
         </w:tabs>
       </w:pPr>
       <w:r>
-        <w:t>Jambon Duroc affiné 24 mois</w:t>
+        <w:t>Pintxos crevettes marinées &amp; guacamole (4 pièces)</w:t>
         <w:tab/>
-        <w:t>7,50 €</w:t>
+        <w:t>7,00 €</w:t>
       </w:r>
     </w:p>
     <w:p>
@@ -3124,7 +3211,7 @@
         </w:tabs>
       </w:pPr>
       <w:r>
-        <w:t>Pintxos crevettes marinées &amp; guacamole (4 pièces)</w:t>
+        <w:t>Brochettes de bœuf au fromage (4 pièces)</w:t>
         <w:tab/>
         <w:t>7,00 €</w:t>
       </w:r>
@@ -3145,7 +3232,7 @@
         </w:tabs>
       </w:pPr>
       <w:r>
-        <w:t>Brochettes de bœuf au fromage (4 pièces)</w:t>
+        <w:t>Chorizos grillés</w:t>
         <w:tab/>
         <w:t>7,00 €</w:t>
       </w:r>
@@ -3166,9 +3253,9 @@
         </w:tabs>
       </w:pPr>
       <w:r>
-        <w:t>Chorizos grillés</w:t>
+        <w:t>Ramequin de tartinade au choix</w:t>
         <w:tab/>
-        <w:t>7,00 €</w:t>
+        <w:t>4,50 €</w:t>
       </w:r>
     </w:p>
     <w:p>
@@ -3177,6 +3264,14 @@
       </w:pPr>
       <w:r>
         <w:t>Fait maison</w:t>
+      </w:r>
+    </w:p>
+    <w:p>
+      <w:pPr>
+        <w:pStyle w:val="Description"/>
+      </w:pPr>
+      <w:r>
+        <w:t>Tomatade, guacamole, pan con tomate ou caviar d’aubergine</w:t>
       </w:r>
     </w:p>
     <w:p>
@@ -3187,9 +3282,9 @@
         </w:tabs>
       </w:pPr>
       <w:r>
-        <w:t>Ramequin de tartinade au choix</w:t>
+        <w:t>Pain à l’ail</w:t>
         <w:tab/>
-        <w:t>4,50 €</w:t>
+        <w:t>4,00 €</w:t>
       </w:r>
     </w:p>
     <w:p>
@@ -3202,10 +3297,22 @@
     </w:p>
     <w:p>
       <w:pPr>
-        <w:pStyle w:val="Description"/>
-      </w:pPr>
-      <w:r>
-        <w:t>Tomatade, guacamole, pan con tomate ou caviar d’aubergine</w:t>
+        <w:pStyle w:val="Heading1"/>
+      </w:pPr>
+      <w:r>
+        <w:t>Fingerfood</w:t>
+      </w:r>
+    </w:p>
+    <w:p>
+      <w:pPr>
+        <w:pStyle w:val="Formats"/>
+        <w:tabs>
+          <w:tab w:pos="9638" w:val="right"/>
+        </w:tabs>
+      </w:pPr>
+      <w:r>
+        <w:tab/>
+        <w:t>Prix</w:t>
       </w:r>
     </w:p>
     <w:p>
@@ -3216,17 +3323,61 @@
         </w:tabs>
       </w:pPr>
       <w:r>
-        <w:t>Pain à l’ail</w:t>
+        <w:t>Chicken wings</w:t>
         <w:tab/>
-        <w:t>4,00 €</w:t>
-      </w:r>
-    </w:p>
-    <w:p>
-      <w:pPr>
-        <w:pStyle w:val="Labels"/>
-      </w:pPr>
-      <w:r>
-        <w:t>Fait maison</w:t>
+        <w:t>8,00 €</w:t>
+      </w:r>
+    </w:p>
+    <w:p>
+      <w:pPr>
+        <w:pStyle w:val="Article"/>
+        <w:tabs>
+          <w:tab w:pos="9638" w:val="right"/>
+        </w:tabs>
+      </w:pPr>
+      <w:r>
+        <w:t>Onion rings</w:t>
+        <w:tab/>
+        <w:t>6,00 €</w:t>
+      </w:r>
+    </w:p>
+    <w:p>
+      <w:pPr>
+        <w:pStyle w:val="Article"/>
+        <w:tabs>
+          <w:tab w:pos="9638" w:val="right"/>
+        </w:tabs>
+      </w:pPr>
+      <w:r>
+        <w:t>Mozzarella sticks</w:t>
+        <w:tab/>
+        <w:t>6,00 €</w:t>
+      </w:r>
+    </w:p>
+    <w:p>
+      <w:pPr>
+        <w:pStyle w:val="Article"/>
+        <w:tabs>
+          <w:tab w:pos="9638" w:val="right"/>
+        </w:tabs>
+      </w:pPr>
+      <w:r>
+        <w:t>Beignets de calamars</w:t>
+        <w:tab/>
+        <w:t>6,00 €</w:t>
+      </w:r>
+    </w:p>
+    <w:p>
+      <w:pPr>
+        <w:pStyle w:val="Article"/>
+        <w:tabs>
+          <w:tab w:pos="9638" w:val="right"/>
+        </w:tabs>
+      </w:pPr>
+      <w:r>
+        <w:t>Frites</w:t>
+        <w:tab/>
+        <w:t>5,00 €</w:t>
       </w:r>
     </w:p>
     <w:p>
@@ -3234,7 +3385,7 @@
         <w:pStyle w:val="Heading1"/>
       </w:pPr>
       <w:r>
-        <w:t>Fingerfood</w:t>
+        <w:t>Desserts</w:t>
       </w:r>
     </w:p>
     <w:p>
@@ -3257,9 +3408,17 @@
         </w:tabs>
       </w:pPr>
       <w:r>
-        <w:t>Chicken wings</w:t>
+        <w:t>Muffin à la châtaigne</w:t>
         <w:tab/>
-        <w:t>8,00 €</w:t>
+        <w:t>6,00 €</w:t>
+      </w:r>
+    </w:p>
+    <w:p>
+      <w:pPr>
+        <w:pStyle w:val="Description"/>
+      </w:pPr>
+      <w:r>
+        <w:t>Supplément boule de glace : 1,00 €</w:t>
       </w:r>
     </w:p>
     <w:p>
@@ -3270,99 +3429,6 @@
         </w:tabs>
       </w:pPr>
       <w:r>
-        <w:t>Onion rings</w:t>
-        <w:tab/>
-        <w:t>6,00 €</w:t>
-      </w:r>
-    </w:p>
-    <w:p>
-      <w:pPr>
-        <w:pStyle w:val="Article"/>
-        <w:tabs>
-          <w:tab w:pos="9638" w:val="right"/>
-        </w:tabs>
-      </w:pPr>
-      <w:r>
-        <w:t>Mozzarella sticks</w:t>
-        <w:tab/>
-        <w:t>6,00 €</w:t>
-      </w:r>
-    </w:p>
-    <w:p>
-      <w:pPr>
-        <w:pStyle w:val="Article"/>
-        <w:tabs>
-          <w:tab w:pos="9638" w:val="right"/>
-        </w:tabs>
-      </w:pPr>
-      <w:r>
-        <w:t>Beignets de calamars</w:t>
-        <w:tab/>
-        <w:t>6,00 €</w:t>
-      </w:r>
-    </w:p>
-    <w:p>
-      <w:pPr>
-        <w:pStyle w:val="Article"/>
-        <w:tabs>
-          <w:tab w:pos="9638" w:val="right"/>
-        </w:tabs>
-      </w:pPr>
-      <w:r>
-        <w:t>Frites</w:t>
-        <w:tab/>
-        <w:t>5,00 €</w:t>
-      </w:r>
-    </w:p>
-    <w:p>
-      <w:pPr>
-        <w:pStyle w:val="Heading1"/>
-      </w:pPr>
-      <w:r>
-        <w:t>Desserts</w:t>
-      </w:r>
-    </w:p>
-    <w:p>
-      <w:pPr>
-        <w:pStyle w:val="Formats"/>
-        <w:tabs>
-          <w:tab w:pos="9638" w:val="right"/>
-        </w:tabs>
-      </w:pPr>
-      <w:r>
-        <w:tab/>
-        <w:t>Prix</w:t>
-      </w:r>
-    </w:p>
-    <w:p>
-      <w:pPr>
-        <w:pStyle w:val="Article"/>
-        <w:tabs>
-          <w:tab w:pos="9638" w:val="right"/>
-        </w:tabs>
-      </w:pPr>
-      <w:r>
-        <w:t>Muffin à la châtaigne</w:t>
-        <w:tab/>
-        <w:t>6,00 €</w:t>
-      </w:r>
-    </w:p>
-    <w:p>
-      <w:pPr>
-        <w:pStyle w:val="Description"/>
-      </w:pPr>
-      <w:r>
-        <w:t>Supplément boule de glace : 2,00 €</w:t>
-      </w:r>
-    </w:p>
-    <w:p>
-      <w:pPr>
-        <w:pStyle w:val="Article"/>
-        <w:tabs>
-          <w:tab w:pos="9638" w:val="right"/>
-        </w:tabs>
-      </w:pPr>
-      <w:r>
         <w:t>Fondant au chocolat</w:t>
         <w:tab/>
         <w:t>5,00 €</w:t>
@@ -3373,7 +3439,7 @@
         <w:pStyle w:val="Description"/>
       </w:pPr>
       <w:r>
-        <w:t>Supplément boule de glace : 2,00 €</w:t>
+        <w:t>Supplément boule de glace : 1,00 €</w:t>
       </w:r>
     </w:p>
     <w:p>
@@ -3418,7 +3484,7 @@
         <w:pStyle w:val="Description"/>
       </w:pPr>
       <w:r>
-        <w:t>Vanille, pistache, mangue, citron, chocolat, framboise, rhum-raisin</w:t>
+        <w:t>Vanille, pistache, citron, chocolat, framboise</w:t>
       </w:r>
     </w:p>
     <w:p>
@@ -3431,19 +3497,6 @@
       <w:r>
         <w:tab/>
         <w:t>Prix</w:t>
-      </w:r>
-    </w:p>
-    <w:p>
-      <w:pPr>
-        <w:pStyle w:val="Article"/>
-        <w:tabs>
-          <w:tab w:pos="9638" w:val="right"/>
-        </w:tabs>
-      </w:pPr>
-      <w:r>
-        <w:t>Supplément café, thé ou infusion avec le dessert</w:t>
-        <w:tab/>
-        <w:t>1,00 €</w:t>
       </w:r>
     </w:p>
     <w:p>

</xml_diff>